<commit_message>
Reviews 1-10, final audit, cover letter, README, requirements, journal fit audit; manuscript rebuilt
Co-Authored-By: Claude Sonnet 5.5 <noreply@anthropic.com>
Claude-Session: https://claude.ai/code/session_017fdFnBNWwmmqUrWFrpu4HP
</commit_message>
<xml_diff>
--- a/manuscript/Final_Manuscript.docx
+++ b/manuscript/Final_Manuscript.docx
@@ -176,7 +176,7 @@
         <w:rPr>
           <w:sz w:val="20"/>
         </w:rPr>
-        <w:t xml:space="preserve">Neither family dominated. At N = 32 the nonlinear-output family won 12 of 16 instances, but by a small margin (mean 0.11 decades in error); at N = 1024 the linear-subspace family won 10 of 16, by a mean 1.35 decades (up to 3.31), whereas the neural advantage never exceeded 0.44 decades. The hypotheses that linear subspaces win at small budgets (H1a) and that neural surrogates catch up with more data (H1b) were not supported; POD+GP improved faster with data (median log–log slope -1.07 vs -0.61–-0.57 for the networks). A pre-registered test of a pilot-data diagnostic (H2) was not significant after correction (Holm-adjusted p = 0.145); exploratory analysis suggests the pilot features carry signal at N ≥ 256 (leave-one-family-out threshold accuracy 88% vs 62% majority) that needs replication. Tuning the neural family harder than the linear one raised the apparent neural win share from 47% to 56% (exact McNemar p = 0.006; Holm-adjusted 0.023), and 11% of cells changed winner between default and tuned settings.</w:t>
+        <w:t xml:space="preserve">Neither family dominated. At N = 32 the nonlinear-output family won 12 of 16 instances, but by a small margin (mean 0.11 decades in error); at N = 1024 the linear-subspace family won 10 of 16, by a mean 1.35 decades (up to 3.31), whereas the neural advantage never exceeded 0.44 decades. The hypotheses that linear subspaces win at small budgets (H1a) and that neural surrogates catch up with more data (H1b) were not supported; POD+GP improved faster with data (median log–log slope -1.07 vs -0.61–-0.57 for the networks). A pre-registered test of a pilot-data diagnostic (H2) was not significant after correction (Holm-adjusted p = 0.145); exploratory analysis suggests the pilot features carry signal at N ≥ 256 (leave-one-family-out threshold accuracy 88% vs 62% majority) that needs replication. Tuning the neural family harder than the linear one raised the apparent neural win share from 47% to 56% (pre-registered exact McNemar p = 0.006; Holm-adjusted 0.023); however, the effect was concentrated in 5 of 16 instances and an instance-level sign test gave p = 0.031 without multiplicity correction. 11% of cells changed winner between default and tuned settings. Removing POD+GP from the linear-subspace family reversed the picture (neural family winning 78% of cells), indicating that the linear-subspace advantage is largely a Gaussian-process advantage.</w:t>
       </w:r>
       <w:r>
         <w:rPr>
@@ -413,7 +413,7 @@
         <w:rPr>
           <w:sz w:val="20"/>
         </w:rPr>
-        <w:t xml:space="preserve">Non-intrusive reduced-order models combine POD with a regressor for the coefficients; Hesthaven and Ubbiali used neural networks for this purpose [Hesthaven &amp; Ubbiali 2018]. PCA-Net applies the same idea in an operator-learning setting [Bhattacharya et al. 2021]. Gaussian processes are standard regressors for low-dimensional parameter spaces [Rasmussen &amp; Williams 2006]; reduced-basis theory is surveyed in [Quarteroni et al. 2016].</w:t>
+        <w:t xml:space="preserve">Non-intrusive reduced-order models combine POD with a regressor for the coefficients; Hesthaven and Ubbiali used neural networks for this purpose [Hesthaven &amp; Ubbiali 2018]. PCA-Net applies the same idea in an operator-learning setting [Bhattacharya et al. 2021]. Gaussian processes are standard regressors for low-dimensional parameter spaces [Rasmussen &amp; Williams 2006] and have been used for the coefficients of reduced-order models [Guo &amp; Hesthaven 2018]; reduced-basis theory is surveyed in [Quarteroni et al. 2016].</w:t>
       </w:r>
     </w:p>
     <w:p>
@@ -2150,6 +2150,31 @@
         <w:t xml:space="preserve">are labelled as such: H3 (extrapolation inflation), feature ablations, pilot-size sensitivity, learning-curve exponents and cost break-even under stylised FOM-cost multipliers.</w:t>
       </w:r>
     </w:p>
+    <w:p>
+      <w:pPr>
+        <w:pStyle w:val="BodyText"/>
+      </w:pPr>
+      <w:r>
+        <w:rPr>
+          <w:bCs/>
+          <w:b/>
+          <w:sz w:val="20"/>
+        </w:rPr>
+        <w:t xml:space="preserve">Software and statistics.</w:t>
+      </w:r>
+      <w:r>
+        <w:rPr>
+          <w:sz w:val="20"/>
+        </w:rPr>
+        <w:t xml:space="preserve"> </w:t>
+      </w:r>
+      <w:r>
+        <w:rPr>
+          <w:sz w:val="20"/>
+        </w:rPr>
+        <w:t xml:space="preserve">Experiments use Python with numpy and scipy [Virtanen et al. 2020], scikit-learn for Gaussian processes and ridge regression [Pedregosa et al. 2011] and PyTorch [Paszke et al. 2019] with the Adam optimiser [Kingma &amp; Ba 2015], on CPU only. One-sided and two-sided Wilcoxon signed-rank tests follow Wilcoxon [1945]; multiplicity is controlled with the Holm procedure [Holm 1979].</w:t>
+      </w:r>
+    </w:p>
     <w:bookmarkEnd w:id="27"/>
     <w:bookmarkStart w:id="43" w:name="results"/>
     <w:p>
@@ -4368,6 +4393,31 @@
     </w:p>
     <w:p>
       <w:pPr>
+        <w:pStyle w:val="BodyText"/>
+      </w:pPr>
+      <w:r>
+        <w:rPr>
+          <w:bCs/>
+          <w:b/>
+          <w:sz w:val="20"/>
+        </w:rPr>
+        <w:t xml:space="preserve">Robustness of H4a (post hoc).</w:t>
+      </w:r>
+      <w:r>
+        <w:rPr>
+          <w:sz w:val="20"/>
+        </w:rPr>
+        <w:t xml:space="preserve"> </w:t>
+      </w:r>
+      <w:r>
+        <w:rPr>
+          <w:sz w:val="20"/>
+        </w:rPr>
+        <w:t xml:space="preserve">The 96 cells are not independent (cells of one instance share training data and seeds). Aggregating to instances, flips occurred in only 5 of 16 instances (advdiff L1, Burgers L1 and L2, heat2d L1 and L2), all in the direction of asymmetric tuning favouring the neural family (5 positive, 0 negative); the one-sided exact sign test over these instances gives p = 0.031 (uncorrected). Had this instance-level test replaced the cell-level one, its Holm-adjusted p with the other three confirmatory tests would be about 0.125, above 0.05. The pre-registered verdict for H4a is therefore reported as registered, but the evidence is fragile and concentrated.</w:t>
+      </w:r>
+    </w:p>
+    <w:p>
+      <w:pPr>
         <w:pStyle w:val="CaptionedFigure"/>
       </w:pPr>
       <w:r>
@@ -4872,6 +4922,71 @@
               <w:rPr>
                 <w:sz w:val="15"/>
               </w:rPr>
+              <w:t xml:space="preserve">E6</w:t>
+            </w:r>
+          </w:p>
+        </w:tc>
+        <w:tc>
+          <w:tcPr>
+            <w:tcW w:type="dxa" w:w="4332"/>
+            <w:tcBorders>
+              <w:top w:val="single" w:sz="4" w:color="BBBBBB"/>
+              <w:bottom w:val="single" w:sz="4" w:color="BBBBBB"/>
+            </w:tcBorders>
+          </w:tcPr>
+          <w:p>
+            <w:pPr>
+              <w:pStyle w:val="Compact"/>
+              <w:jc w:val="left"/>
+            </w:pPr>
+            <w:r>
+              <w:rPr>
+                <w:sz w:val="15"/>
+              </w:rPr>
+              <w:t xml:space="preserve">family composition / H4a clustering</w:t>
+            </w:r>
+          </w:p>
+        </w:tc>
+        <w:tc>
+          <w:tcPr>
+            <w:tcW w:type="dxa" w:w="4332"/>
+            <w:tcBorders>
+              <w:top w:val="single" w:sz="4" w:color="BBBBBB"/>
+              <w:bottom w:val="single" w:sz="4" w:color="BBBBBB"/>
+            </w:tcBorders>
+          </w:tcPr>
+          <w:p>
+            <w:pPr>
+              <w:pStyle w:val="Compact"/>
+              <w:jc w:val="left"/>
+            </w:pPr>
+            <w:r>
+              <w:rPr>
+                <w:sz w:val="15"/>
+              </w:rPr>
+              <w:t xml:space="preserve">w/o POD+GP the NL family wins 78% of cells; H4a instance-level sign test p = 0.031 (5/16 instances contribute)</w:t>
+            </w:r>
+          </w:p>
+        </w:tc>
+      </w:tr>
+      <w:tr>
+        <w:tc>
+          <w:tcPr>
+            <w:tcW w:type="dxa" w:w="975"/>
+            <w:tcBorders>
+              <w:top w:val="single" w:sz="4" w:color="BBBBBB"/>
+              <w:bottom w:val="single" w:sz="4" w:color="BBBBBB"/>
+            </w:tcBorders>
+          </w:tcPr>
+          <w:p>
+            <w:pPr>
+              <w:pStyle w:val="Compact"/>
+              <w:jc w:val="left"/>
+            </w:pPr>
+            <w:r>
+              <w:rPr>
+                <w:sz w:val="15"/>
+              </w:rPr>
               <w:t xml:space="preserve">E5</w:t>
             </w:r>
           </w:p>
@@ -4943,6 +5058,31 @@
           <w:sz w:val="20"/>
         </w:rPr>
         <w:t xml:space="preserve">At N ≥ 256 the pilot CV-POD error correlated with ȳ (Spearman ρ = -0.69 at N = 256) in the direction predicted by n-width theory — slower spectral decay, relatively better neural surrogate — and a one-feature leave-one-family-out threshold rule classified the winner correctly for 14 of 16 instances at N = 1024 (majority baseline 62.5%). At N = 64 the rule was no better than chance (31.2%). With 16 instances from 8 families, selected after seeing the data, this is a hypothesis for replication, not a result.</w:t>
+      </w:r>
+    </w:p>
+    <w:p>
+      <w:pPr>
+        <w:pStyle w:val="BodyText"/>
+      </w:pPr>
+      <w:r>
+        <w:rPr>
+          <w:iCs/>
+          <w:i/>
+          <w:sz w:val="20"/>
+        </w:rPr>
+        <w:t xml:space="preserve">Which linear-subspace method drives the result (E6).</w:t>
+      </w:r>
+      <w:r>
+        <w:rPr>
+          <w:sz w:val="20"/>
+        </w:rPr>
+        <w:t xml:space="preserve"> </w:t>
+      </w:r>
+      <w:r>
+        <w:rPr>
+          <w:sz w:val="20"/>
+        </w:rPr>
+        <w:t xml:space="preserve">Restricting the linear-subspace family to subsets of its methods and repeating H1a/H1b: with {POD+GP, POD+MLP} or {POD+GP, POD+Poly} the verdicts are unchanged (neural family wins 12 / 10 instances at N = 32), so the 3-versus-2 method asymmetry between families does not drive the results. Without POD+GP (family {POD+MLP, POD+Poly}) the neural family wins 78% of cells and 14 of 16 instances at N = 1024, and H1b would be met (13/16 instances, exact p = 0.011; exploratory). The linear-subspace advantage reported above is therefore essentially an advantage of Gaussian-process regression of POD coefficients.</w:t>
       </w:r>
     </w:p>
     <w:p>
@@ -5131,7 +5271,7 @@
         <w:rPr>
           <w:sz w:val="20"/>
         </w:rPr>
-        <w:t xml:space="preserve">The confirmed H4a effect is moderate (about nine percentage points of cells) but it is precisely the direction of bias described for the literature (McGreivy &amp; Hakim 2024): giving only the proposed family a search budget turns ties into wins. Because a tenth of cells changed winner between default and tuned settings even under symmetric treatment, reports of surrogate comparisons should state the tuning budget per method.</w:t>
+        <w:t xml:space="preserve">The pre-registered H4a effect is moderate (about nine percentage points of cells) and in the direction of bias described for the literature (McGreivy &amp; Hakim 2024): giving only one family a search budget turns near-ties into wins. It is, however, concentrated in five instances and would not survive Holm correction if tested at the instance level, so it should be read as a demonstration of the mechanism in this suite and not as an estimate of how large the bias is in the literature. Because a tenth of cells changed winner between default and tuned settings even under symmetric treatment, reports of surrogate comparisons should state the tuning budget per method, in the spirit of reporting results as a function of tuning budget (Dodge et al. 2019).</w:t>
       </w:r>
     </w:p>
     <w:p>
@@ -5144,6 +5284,31 @@
           <w:b/>
           <w:sz w:val="20"/>
         </w:rPr>
+        <w:t xml:space="preserve">What drives the linear-subspace advantage.</w:t>
+      </w:r>
+      <w:r>
+        <w:rPr>
+          <w:sz w:val="20"/>
+        </w:rPr>
+        <w:t xml:space="preserve"> </w:t>
+      </w:r>
+      <w:r>
+        <w:rPr>
+          <w:sz w:val="20"/>
+        </w:rPr>
+        <w:t xml:space="preserve">Our decomposition shows that POD+GP, not POD per se, carries the advantage: POD+MLP and POD+polynomial ridge together lost most cells to the direct and bottleneck networks. Smooth parameter-to-coefficient maps in few dimensions are the setting in which GP regression is expected to excel; a stationary ARD kernel may also be the reason it falls behind on instances with localised or moving features, an alternative explanation to manifold complexity that our experiments cannot separate.</w:t>
+      </w:r>
+    </w:p>
+    <w:p>
+      <w:pPr>
+        <w:pStyle w:val="BodyText"/>
+      </w:pPr>
+      <w:r>
+        <w:rPr>
+          <w:bCs/>
+          <w:b/>
+          <w:sz w:val="20"/>
+        </w:rPr>
         <w:t xml:space="preserve">Relation to prior work.</w:t>
       </w:r>
       <w:r>
@@ -5180,7 +5345,7 @@
         <w:rPr>
           <w:sz w:val="20"/>
         </w:rPr>
-        <w:t xml:space="preserve">First, sixteen instances from eight hand-chosen families are not a random sample of PDEs; conclusions concern this suite, and the confirmatory tests have limited power (8 independent families). (2) Parameters are low-dimensional (p ≤ 10) and fields are small (m ≤ 256); high-dimensional or field-valued inputs (e.g., Fourier neural operators) were not studied. (3) Neural networks were small, trained for a fixed 1500 epochs in float32 on CPU, and hyper-parameter spaces were chosen by us; larger budgets or other architectures could narrow or move the gaps (E1 shows magnitudes are budget-sensitive). (4) The POD+GP implementation uses a single-start optimiser that failed in 1.4% of final fits. (5) Intrusive POD-Galerkin was not included. (6) Seeds draw nested subsets of a finite pool, so seed-to-seed variance underestimates sampling variance at large N; only three seeds were run (the planned extension to five was not). (7) The pre-registered baseline B1 for H2 turned out to be degenerate under leave-one-family-out evaluation; the verdict is reported as registered. (8) All problems are synthetic simulations with discretisation-defined ground truth, and full-order-model costs are milliseconds, so cost statements are stylised. (9) The exploratory analyses were conceived after seeing the results.</w:t>
+        <w:t xml:space="preserve">First, sixteen instances from eight hand-chosen families are not a random sample of PDEs; conclusions concern this suite, and the confirmatory tests have limited power (8 independent families). (2) Parameters are low-dimensional (p ≤ 10) and fields are small (m ≤ 256); high-dimensional or field-valued inputs (e.g., Fourier neural operators) were not studied. (3) Neural networks were small, trained for a fixed 1500 epochs in float32 on CPU, and hyper-parameter spaces were chosen by us; larger budgets or other architectures could narrow or move the gaps (E1 shows magnitudes are budget-sensitive). (4) The POD+GP implementation uses a single-start optimiser that failed in 1.4% of final fits. (5) Intrusive POD-Galerkin was not included. (6) Seeds draw nested subsets of a finite pool, so seed-to-seed variance underestimates sampling variance at large N; only three seeds were run (the planned extension to five was not). (7) The pre-registered baseline B1 for H2 turned out to be degenerate under leave-one-family-out evaluation; the verdict is reported as registered. (8) All problems are synthetic simulations with discretisation-defined ground truth, and full-order-model costs are milliseconds, so cost statements are stylised. (9) The exploratory analyses, including the robustness checks E4–E6, were conceived after seeing the results and are not corrected for multiplicity. (10) The validation split at N = 32 contains only 6 samples, so model selection there is noisy; Gaussian-process cost grows cubically with N, and neither this nor N &gt; 1024 was studied. (11) The H4a effect rests on five of sixteen instances.</w:t>
       </w:r>
     </w:p>
     <w:bookmarkEnd w:id="45"/>
@@ -5204,7 +5369,7 @@
         <w:rPr>
           <w:sz w:val="20"/>
         </w:rPr>
-        <w:t xml:space="preserve">For parametric PDEs with low-dimensional parameters, neither linear-subspace nor neural surrogates were uniformly superior in a matched-tuning, pre-registered comparison on 16 simulated instances. Linear-subspace surrogates with Gaussian-process regression gave very large accuracy gains where solution spectra decay fast, and their advantage grew with the number of training solves; neural surrogates gave modest gains on front- and transport-dominated instances. Unequal tuning effort measurably inflated the apparent neural advantage. A pilot-data selection rule was not confirmed; the exploratory signal at moderate budgets deserves replication on new PDE families before any practical recommendation.</w:t>
+        <w:t xml:space="preserve">For parametric PDEs with low-dimensional parameters, neither linear-subspace nor neural surrogates were uniformly superior in a matched-tuning, pre-registered comparison on 16 simulated instances. Linear-subspace surrogates with Gaussian-process regression (the advantage disappears without the Gaussian process) gave very large accuracy gains where solution spectra decay fast, and their advantage grew with the number of training solves; neural surrogates gave modest gains on front- and transport-dominated instances. Unequal tuning effort inflated the apparent neural advantage in the pre-registered cell-level test, although the effect was concentrated in five instances. A pilot-data selection rule was not confirmed; the exploratory signal at moderate budgets deserves replication on new PDE families before any practical recommendation.</w:t>
       </w:r>
     </w:p>
     <w:bookmarkEnd w:id="46"/>
@@ -5635,7 +5800,7 @@
         <w:rPr>
           <w:sz w:val="20"/>
         </w:rPr>
-        <w:t xml:space="preserve">Greif C, Urban K (2019) Decay of the Kolmogorov N-width for wave problems. Appl Math Lett 96:216-222. 10.1016/j.aml.2019.05.013</w:t>
+        <w:t xml:space="preserve">Guo M, Hesthaven JS (2018) Reduced order modeling for nonlinear structural analysis using Gaussian process regression. Comput Methods Appl Mech Eng 341:807-826. 10.1016/j.cma.2018.07.017</w:t>
       </w:r>
     </w:p>
     <w:p>
@@ -5649,7 +5814,7 @@
         <w:rPr>
           <w:sz w:val="20"/>
         </w:rPr>
-        <w:t xml:space="preserve">Grossmann TG, Komorowska UJ, Latz J, Schönlieb C-B (2024) Can physics-informed neural networks beat the finite element method? IMA J Appl Math 89(1):143-174. 10.1093/imamat/hxae011</w:t>
+        <w:t xml:space="preserve">Greif C, Urban K (2019) Decay of the Kolmogorov N-width for wave problems. Appl Math Lett 96:216-222. 10.1016/j.aml.2019.05.013</w:t>
       </w:r>
     </w:p>
     <w:p>
@@ -5663,7 +5828,7 @@
         <w:rPr>
           <w:sz w:val="20"/>
         </w:rPr>
-        <w:t xml:space="preserve">Hesthaven JS, Ubbiali S (2018) Non-intrusive reduced order modeling of nonlinear problems using neural networks. J Comput Phys 363:55-78. 10.1016/j.jcp.2018.02.037</w:t>
+        <w:t xml:space="preserve">Grossmann TG, Komorowska UJ, Latz J, Schönlieb C-B (2024) Can physics-informed neural networks beat the finite element method? IMA J Appl Math 89(1):143-174. 10.1093/imamat/hxae011</w:t>
       </w:r>
     </w:p>
     <w:p>
@@ -5677,7 +5842,7 @@
         <w:rPr>
           <w:sz w:val="20"/>
         </w:rPr>
-        <w:t xml:space="preserve">Holm S (1979) A simple sequentially rejective multiple test procedure. Scand J Stat 6(2):65-70. JSTOR 4615733</w:t>
+        <w:t xml:space="preserve">Hesthaven JS, Ubbiali S (2018) Non-intrusive reduced order modeling of nonlinear problems using neural networks. J Comput Phys 363:55-78. 10.1016/j.jcp.2018.02.037</w:t>
       </w:r>
     </w:p>
     <w:p>
@@ -5691,7 +5856,7 @@
         <w:rPr>
           <w:sz w:val="20"/>
         </w:rPr>
-        <w:t xml:space="preserve">Huang DZ, Stuart AM (2026) Cost-accuracy trade-offs: neural operator vs classical numerical solver. arXiv:2609.24021. arXiv:2609.24021</w:t>
+        <w:t xml:space="preserve">Holm S (1979) A simple sequentially rejective multiple test procedure. Scand J Stat 6(2):65-70. JSTOR 4615733</w:t>
       </w:r>
     </w:p>
     <w:p>
@@ -5705,7 +5870,7 @@
         <w:rPr>
           <w:sz w:val="20"/>
         </w:rPr>
-        <w:t xml:space="preserve">Kingma DP, Ba J (2015) Adam: a method for stochastic optimization. ICLR 2015. arXiv:1412.6980</w:t>
+        <w:t xml:space="preserve">Huang DZ, Stuart AM (2026) Cost-accuracy trade-offs: neural operator vs classical numerical solver. arXiv:2609.24021. arXiv:2609.24021</w:t>
       </w:r>
     </w:p>
     <w:p>
@@ -5719,7 +5884,7 @@
         <w:rPr>
           <w:sz w:val="20"/>
         </w:rPr>
-        <w:t xml:space="preserve">Kontolati K, Goswami S, Em Karniadakis G, Shields MD (2024) Learning nonlinear operators in latent spaces for real-time predictions of complex dynamics in physical systems. Nat Commun 15:5101. 10.1038/s41467-024-49411-w</w:t>
+        <w:t xml:space="preserve">Kingma DP, Ba J (2015) Adam: a method for stochastic optimization. ICLR 2015. arXiv:1412.6980</w:t>
       </w:r>
     </w:p>
     <w:p>
@@ -5734,20 +5899,6 @@
           <w:sz w:val="20"/>
         </w:rPr>
         <w:t xml:space="preserve">Kovachki N, Li Z, Liu B, Azizzadenesheli K, Bhattacharya K, Stuart A, Anandkumar A (2023) Neural operator: learning maps between function spaces with applications to PDEs. J Mach Learn Res 24(89):1-97. JMLR 24(89)</w:t>
-      </w:r>
-    </w:p>
-    <w:p>
-      <w:pPr>
-        <w:numPr>
-          <w:ilvl w:val="0"/>
-          <w:numId w:val="1001"/>
-        </w:numPr>
-      </w:pPr>
-      <w:r>
-        <w:rPr>
-          <w:sz w:val="20"/>
-        </w:rPr>
-        <w:t xml:space="preserve">Krishnapriyan AS, Gholami A, Zhe S, Kirby RM, Mahoney MW (2021) Characterizing possible failure modes in physics-informed neural networks. NeurIPS 2021. arXiv:2109.01050</w:t>
       </w:r>
     </w:p>
     <w:p>

</xml_diff>

<commit_message>
Fix process-salted hash seeding in HPO (found by fresh-clone audit); replay check reproduces 20/20 recorded errors; disclose D5
Co-Authored-By: Claude Sonnet 5.5 <noreply@anthropic.com>
Claude-Session: https://claude.ai/code/session_017fdFnBNWwmmqUrWFrpu4HP
</commit_message>
<xml_diff>
--- a/manuscript/Final_Manuscript.docx
+++ b/manuscript/Final_Manuscript.docx
@@ -5600,7 +5600,7 @@
         <w:rPr>
           <w:sz w:val="20"/>
         </w:rPr>
-        <w:t xml:space="preserve">reproduces the experiment (≈3.5 h on 4 CPU cores) and</w:t>
+        <w:t xml:space="preserve">re-executes the experiment (≈3.5 h on 4 CPU cores) and</w:t>
       </w:r>
       <w:r>
         <w:rPr>
@@ -5625,7 +5625,58 @@
         <w:rPr>
           <w:sz w:val="20"/>
         </w:rPr>
-        <w:t xml:space="preserve">regenerates statistics, tables and figures.</w:t>
+        <w:t xml:space="preserve">regenerates statistics, tables and figures from the stored raw results (verified in a fresh clone: identical statistics).</w:t>
+      </w:r>
+      <w:r>
+        <w:rPr>
+          <w:sz w:val="20"/>
+        </w:rPr>
+        <w:t xml:space="preserve"> </w:t>
+      </w:r>
+      <w:r>
+        <w:rPr>
+          <w:bCs/>
+          <w:b/>
+          <w:sz w:val="20"/>
+        </w:rPr>
+        <w:t xml:space="preserve">Reproducibility caveat:</w:t>
+      </w:r>
+      <w:r>
+        <w:rPr>
+          <w:sz w:val="20"/>
+        </w:rPr>
+        <w:t xml:space="preserve"> </w:t>
+      </w:r>
+      <w:r>
+        <w:rPr>
+          <w:sz w:val="20"/>
+        </w:rPr>
+        <w:t xml:space="preserve">the reported run used a random-search seeding that differed between processes (a bug found in our audit and since fixed), so a from-scratch re-execution samples different but statistically equivalent hyper-parameter trials; every sampled configuration is stored in the raw results and</w:t>
+      </w:r>
+      <w:r>
+        <w:rPr>
+          <w:sz w:val="20"/>
+        </w:rPr>
+        <w:t xml:space="preserve"> </w:t>
+      </w:r>
+      <w:r>
+        <w:rPr>
+          <w:rStyle w:val="VerbatimChar"/>
+          <w:sz w:val="20"/>
+        </w:rPr>
+        <w:t xml:space="preserve">experiments/replay_check.py</w:t>
+      </w:r>
+      <w:r>
+        <w:rPr>
+          <w:sz w:val="20"/>
+        </w:rPr>
+        <w:t xml:space="preserve"> </w:t>
+      </w:r>
+      <w:r>
+        <w:rPr>
+          <w:sz w:val="20"/>
+        </w:rPr>
+        <w:t xml:space="preserve">reproduces recorded errors exactly from them (20 of 20 replays).</w:t>
       </w:r>
       <w:r>
         <w:rPr>

</xml_diff>